<commit_message>
Update Ethics, Systems & Culture documents with latest versions
</commit_message>
<xml_diff>
--- a/assets/downloads/Cultural_Adaptation_Reflection.docx
+++ b/assets/downloads/Cultural_Adaptation_Reflection.docx
@@ -35,6 +35,21 @@
         <w:t>- Build personal rapport with team members through regular one-on-one meetings.</w:t>
         <w:br/>
         <w:t>- Adapt my leadership style to be more approachable, promoting transparency and inclusiveness.</w:t>
+      </w:r>
+    </w:p>
+    <w:p>
+      <w:r>
+        <w:br/>
+        <w:br/>
+        <w:t>References:</w:t>
+        <w:br/>
+        <w:t>[1] Association for Computing Machinery (ACM). (2022). ACM Code of Ethics and Professional Conduct. https://www.acm.org/code-of-ethics</w:t>
+        <w:br/>
+        <w:t>[2] American Psychological Association (APA). (2020). Publication Manual of the American Psychological Association (7th ed.).</w:t>
+        <w:br/>
+        <w:t>[3] U.S. Equal Employment Opportunity Commission. (2023). Laws Enforced by EEOC. https://www.eeoc.gov/laws-guidance</w:t>
+        <w:br/>
+        <w:t>[4] Hofstede Insights. (2023). Country Comparison. https://www.hofstede-insights.com/product/compare-countries/</w:t>
       </w:r>
     </w:p>
     <w:sectPr>

</xml_diff>